<commit_message>
Finalize mainland storage research pagination
- Move the research masthead into the cover content to avoid inconsistent
  office-renderer headers, while keeping one footer for all page numbers.
- Add deliberate page breaks for the compatibility gate, continued provider
  table, implementation sequence, and final decision table.
- Regenerate and visually verify the complete 10-page assessment without
  clipped content, local paths, credentials, or personal document metadata.
</commit_message>
<xml_diff>
--- a/docs/MAINLAND_CHINA_OBJECT_STORAGE_COMPATIBILITY_ASSESSMENT_2026-09-01.docx
+++ b/docs/MAINLAND_CHINA_OBJECT_STORAGE_COMPATIBILITY_ASSESSMENT_2026-09-01.docx
@@ -2,6 +2,35 @@
 <file path=word/document.xml><?xml version="1.0" encoding="utf-8"?>
 <w:document xmlns:wpc="http://schemas.microsoft.com/office/word/2010/wordprocessingCanvas" xmlns:mo="http://schemas.microsoft.com/office/mac/office/2008/main" xmlns:mc="http://schemas.openxmlformats.org/markup-compatibility/2006" xmlns:mv="urn:schemas-microsoft-com:mac:vml" xmlns:o="urn:schemas-microsoft-com:office:office" xmlns:r="http://schemas.openxmlformats.org/officeDocument/2006/relationships" xmlns:m="http://schemas.openxmlformats.org/officeDocument/2006/math" xmlns:v="urn:schemas-microsoft-com:vml" xmlns:wp14="http://schemas.microsoft.com/office/word/2010/wordprocessingDrawing" xmlns:wp="http://schemas.openxmlformats.org/drawingml/2006/wordprocessingDrawing" xmlns:w10="urn:schemas-microsoft-com:office:word" xmlns:w="http://schemas.openxmlformats.org/wordprocessingml/2006/main" xmlns:w14="http://schemas.microsoft.com/office/word/2010/wordml" xmlns:wpg="http://schemas.microsoft.com/office/word/2010/wordprocessingGroup" xmlns:wpi="http://schemas.microsoft.com/office/word/2010/wordprocessingInk" xmlns:wne="http://schemas.microsoft.com/office/word/2006/wordml" xmlns:wps="http://schemas.microsoft.com/office/word/2010/wordprocessingShape" mc:Ignorable="w14 wp14">
   <w:body>
+    <w:p>
+      <w:pPr>
+        <w:tabs>
+          <w:tab w:pos="9360" w:val="right"/>
+        </w:tabs>
+        <w:spacing w:before="0" w:after="480"/>
+      </w:pPr>
+      <w:r>
+        <w:rPr>
+          <w:rFonts w:ascii="Calibri" w:hAnsi="Calibri"/>
+          <w:b/>
+          <w:color w:val="5A6573"/>
+          <w:sz w:val="17"/>
+        </w:rPr>
+        <w:t>MALLARD | TECHNICAL RESEARCH</w:t>
+      </w:r>
+      <w:r>
+        <w:tab/>
+      </w:r>
+      <w:r>
+        <w:rPr>
+          <w:rFonts w:ascii="Calibri" w:hAnsi="Calibri"/>
+          <w:b/>
+          <w:color w:val="5A6573"/>
+          <w:sz w:val="17"/>
+        </w:rPr>
+        <w:t>MAINLAND CHINA OBJECT STORAGE</w:t>
+      </w:r>
+    </w:p>
     <w:p>
       <w:pPr>
         <w:pStyle w:val="Title"/>
@@ -176,6 +205,7 @@
           <w:numId w:val="10"/>
         </w:numPr>
         <w:keepLines/>
+        <w:pageBreakBefore w:val="0"/>
         <w:spacing w:before="0" w:after="160" w:line="280" w:lineRule="auto"/>
       </w:pPr>
       <w:r>
@@ -201,6 +231,7 @@
           <w:numId w:val="10"/>
         </w:numPr>
         <w:keepLines/>
+        <w:pageBreakBefore w:val="0"/>
         <w:spacing w:before="0" w:after="160" w:line="280" w:lineRule="auto"/>
       </w:pPr>
       <w:r>
@@ -226,6 +257,7 @@
           <w:numId w:val="10"/>
         </w:numPr>
         <w:keepLines/>
+        <w:pageBreakBefore w:val="0"/>
         <w:spacing w:before="0" w:after="160" w:line="280" w:lineRule="auto"/>
       </w:pPr>
       <w:r>
@@ -251,6 +283,7 @@
           <w:numId w:val="10"/>
         </w:numPr>
         <w:keepLines/>
+        <w:pageBreakBefore w:val="0"/>
         <w:spacing w:before="0" w:after="160" w:line="280" w:lineRule="auto"/>
       </w:pPr>
       <w:r>
@@ -344,6 +377,7 @@
           <w:numId w:val="11"/>
         </w:numPr>
         <w:keepLines/>
+        <w:pageBreakBefore w:val="0"/>
         <w:spacing w:before="0" w:after="160" w:line="280" w:lineRule="auto"/>
       </w:pPr>
       <w:r>
@@ -361,6 +395,7 @@
           <w:numId w:val="11"/>
         </w:numPr>
         <w:keepLines/>
+        <w:pageBreakBefore w:val="0"/>
         <w:spacing w:before="0" w:after="160" w:line="280" w:lineRule="auto"/>
       </w:pPr>
       <w:r>
@@ -378,6 +413,7 @@
           <w:numId w:val="11"/>
         </w:numPr>
         <w:keepLines/>
+        <w:pageBreakBefore w:val="0"/>
         <w:spacing w:before="0" w:after="160" w:line="280" w:lineRule="auto"/>
       </w:pPr>
       <w:r>
@@ -395,6 +431,7 @@
           <w:numId w:val="11"/>
         </w:numPr>
         <w:keepLines/>
+        <w:pageBreakBefore w:val="0"/>
         <w:spacing w:before="0" w:after="160" w:line="280" w:lineRule="auto"/>
       </w:pPr>
       <w:r>
@@ -412,6 +449,7 @@
           <w:numId w:val="11"/>
         </w:numPr>
         <w:keepLines/>
+        <w:pageBreakBefore w:val="0"/>
         <w:spacing w:before="0" w:after="160" w:line="280" w:lineRule="auto"/>
       </w:pPr>
       <w:r>
@@ -466,6 +504,7 @@
           <w:numId w:val="12"/>
         </w:numPr>
         <w:keepLines/>
+        <w:pageBreakBefore w:val="0"/>
         <w:spacing w:before="0" w:after="160" w:line="280" w:lineRule="auto"/>
       </w:pPr>
       <w:r>
@@ -483,6 +522,7 @@
           <w:numId w:val="12"/>
         </w:numPr>
         <w:keepLines/>
+        <w:pageBreakBefore w:val="0"/>
         <w:spacing w:before="0" w:after="160" w:line="280" w:lineRule="auto"/>
       </w:pPr>
       <w:r>
@@ -500,6 +540,7 @@
           <w:numId w:val="12"/>
         </w:numPr>
         <w:keepLines/>
+        <w:pageBreakBefore w:val="0"/>
         <w:spacing w:before="0" w:after="160" w:line="280" w:lineRule="auto"/>
       </w:pPr>
       <w:r>
@@ -517,6 +558,7 @@
           <w:numId w:val="12"/>
         </w:numPr>
         <w:keepLines/>
+        <w:pageBreakBefore w:val="0"/>
         <w:spacing w:before="0" w:after="160" w:line="280" w:lineRule="auto"/>
       </w:pPr>
       <w:r>
@@ -534,6 +576,7 @@
           <w:numId w:val="12"/>
         </w:numPr>
         <w:keepLines/>
+        <w:pageBreakBefore w:val="0"/>
         <w:spacing w:before="0" w:after="160" w:line="280" w:lineRule="auto"/>
       </w:pPr>
       <w:r>
@@ -551,6 +594,7 @@
           <w:numId w:val="12"/>
         </w:numPr>
         <w:keepLines/>
+        <w:pageBreakBefore w:val="0"/>
         <w:spacing w:before="0" w:after="160" w:line="280" w:lineRule="auto"/>
       </w:pPr>
       <w:r>
@@ -564,6 +608,7 @@
     <w:p>
       <w:pPr>
         <w:pStyle w:val="Heading2"/>
+        <w:pageBreakBefore/>
       </w:pPr>
       <w:r>
         <w:t>2.3 Compatibility gate</w:t>
@@ -589,6 +634,7 @@
           <w:numId w:val="13"/>
         </w:numPr>
         <w:keepLines/>
+        <w:pageBreakBefore w:val="0"/>
         <w:spacing w:before="0" w:after="160" w:line="280" w:lineRule="auto"/>
       </w:pPr>
       <w:r>
@@ -606,6 +652,7 @@
           <w:numId w:val="13"/>
         </w:numPr>
         <w:keepLines/>
+        <w:pageBreakBefore w:val="0"/>
         <w:spacing w:before="0" w:after="160" w:line="280" w:lineRule="auto"/>
       </w:pPr>
       <w:r>
@@ -623,6 +670,7 @@
           <w:numId w:val="13"/>
         </w:numPr>
         <w:keepLines/>
+        <w:pageBreakBefore w:val="0"/>
         <w:spacing w:before="0" w:after="160" w:line="280" w:lineRule="auto"/>
       </w:pPr>
       <w:r>
@@ -640,6 +688,7 @@
           <w:numId w:val="13"/>
         </w:numPr>
         <w:keepLines/>
+        <w:pageBreakBefore w:val="0"/>
         <w:spacing w:before="0" w:after="160" w:line="280" w:lineRule="auto"/>
       </w:pPr>
       <w:r>
@@ -657,6 +706,7 @@
           <w:numId w:val="13"/>
         </w:numPr>
         <w:keepLines/>
+        <w:pageBreakBefore w:val="0"/>
         <w:spacing w:before="0" w:after="160" w:line="280" w:lineRule="auto"/>
       </w:pPr>
       <w:r>
@@ -674,6 +724,7 @@
           <w:numId w:val="13"/>
         </w:numPr>
         <w:keepLines/>
+        <w:pageBreakBefore w:val="0"/>
         <w:spacing w:before="0" w:after="160" w:line="280" w:lineRule="auto"/>
       </w:pPr>
       <w:r>
@@ -691,6 +742,7 @@
           <w:numId w:val="13"/>
         </w:numPr>
         <w:keepLines/>
+        <w:pageBreakBefore w:val="0"/>
         <w:spacing w:before="0" w:after="160" w:line="280" w:lineRule="auto"/>
       </w:pPr>
       <w:r>
@@ -708,6 +760,7 @@
           <w:numId w:val="13"/>
         </w:numPr>
         <w:keepLines/>
+        <w:pageBreakBefore w:val="0"/>
         <w:spacing w:before="0" w:after="160" w:line="280" w:lineRule="auto"/>
       </w:pPr>
       <w:r>
@@ -725,6 +778,7 @@
           <w:numId w:val="13"/>
         </w:numPr>
         <w:keepLines/>
+        <w:pageBreakBefore w:val="0"/>
         <w:spacing w:before="0" w:after="160" w:line="280" w:lineRule="auto"/>
       </w:pPr>
       <w:r>
@@ -742,6 +796,7 @@
           <w:numId w:val="13"/>
         </w:numPr>
         <w:keepLines/>
+        <w:pageBreakBefore w:val="0"/>
         <w:spacing w:before="0" w:after="160" w:line="280" w:lineRule="auto"/>
       </w:pPr>
       <w:r>
@@ -1386,13 +1441,9 @@
       </w:tr>
     </w:tbl>
     <w:p>
-      <w:r>
-        <w:br w:type="page"/>
-      </w:r>
-    </w:p>
-    <w:p>
       <w:pPr>
         <w:keepNext/>
+        <w:pageBreakBefore/>
         <w:spacing w:before="0" w:after="160"/>
       </w:pPr>
       <w:r>
@@ -3063,6 +3114,7 @@
           <w:numId w:val="14"/>
         </w:numPr>
         <w:keepLines/>
+        <w:pageBreakBefore w:val="0"/>
         <w:spacing w:before="0" w:after="160" w:line="280" w:lineRule="auto"/>
       </w:pPr>
       <w:r>
@@ -3080,6 +3132,7 @@
           <w:numId w:val="14"/>
         </w:numPr>
         <w:keepLines/>
+        <w:pageBreakBefore w:val="0"/>
         <w:spacing w:before="0" w:after="160" w:line="280" w:lineRule="auto"/>
       </w:pPr>
       <w:r>
@@ -3097,6 +3150,7 @@
           <w:numId w:val="14"/>
         </w:numPr>
         <w:keepLines/>
+        <w:pageBreakBefore w:val="0"/>
         <w:spacing w:before="0" w:after="160" w:line="280" w:lineRule="auto"/>
       </w:pPr>
       <w:r>
@@ -3114,6 +3168,7 @@
           <w:numId w:val="14"/>
         </w:numPr>
         <w:keepLines/>
+        <w:pageBreakBefore w:val="0"/>
         <w:spacing w:before="0" w:after="160" w:line="280" w:lineRule="auto"/>
       </w:pPr>
       <w:r>
@@ -3131,6 +3186,7 @@
           <w:numId w:val="14"/>
         </w:numPr>
         <w:keepLines/>
+        <w:pageBreakBefore w:val="0"/>
         <w:spacing w:before="0" w:after="160" w:line="280" w:lineRule="auto"/>
       </w:pPr>
       <w:r>
@@ -3148,6 +3204,7 @@
           <w:numId w:val="14"/>
         </w:numPr>
         <w:keepLines/>
+        <w:pageBreakBefore/>
         <w:spacing w:before="0" w:after="160" w:line="280" w:lineRule="auto"/>
       </w:pPr>
       <w:r>
@@ -3165,6 +3222,7 @@
           <w:numId w:val="14"/>
         </w:numPr>
         <w:keepLines/>
+        <w:pageBreakBefore w:val="0"/>
         <w:spacing w:before="0" w:after="160" w:line="280" w:lineRule="auto"/>
       </w:pPr>
       <w:r>
@@ -3182,6 +3240,7 @@
           <w:numId w:val="14"/>
         </w:numPr>
         <w:keepLines/>
+        <w:pageBreakBefore w:val="0"/>
         <w:spacing w:before="0" w:after="160" w:line="280" w:lineRule="auto"/>
       </w:pPr>
       <w:r>
@@ -3199,6 +3258,7 @@
           <w:numId w:val="14"/>
         </w:numPr>
         <w:keepLines/>
+        <w:pageBreakBefore w:val="0"/>
         <w:spacing w:before="0" w:after="160" w:line="280" w:lineRule="auto"/>
       </w:pPr>
       <w:r>
@@ -3216,6 +3276,7 @@
           <w:numId w:val="14"/>
         </w:numPr>
         <w:keepLines/>
+        <w:pageBreakBefore w:val="0"/>
         <w:spacing w:before="0" w:after="160" w:line="280" w:lineRule="auto"/>
       </w:pPr>
       <w:r>
@@ -3241,6 +3302,7 @@
           <w:numId w:val="15"/>
         </w:numPr>
         <w:keepLines/>
+        <w:pageBreakBefore w:val="0"/>
         <w:spacing w:before="0" w:after="160" w:line="280" w:lineRule="auto"/>
       </w:pPr>
       <w:r>
@@ -3266,6 +3328,7 @@
           <w:numId w:val="15"/>
         </w:numPr>
         <w:keepLines/>
+        <w:pageBreakBefore w:val="0"/>
         <w:spacing w:before="0" w:after="160" w:line="280" w:lineRule="auto"/>
       </w:pPr>
       <w:r>
@@ -3291,6 +3354,7 @@
           <w:numId w:val="15"/>
         </w:numPr>
         <w:keepLines/>
+        <w:pageBreakBefore w:val="0"/>
         <w:spacing w:before="0" w:after="160" w:line="280" w:lineRule="auto"/>
       </w:pPr>
       <w:r>
@@ -3316,6 +3380,7 @@
           <w:numId w:val="15"/>
         </w:numPr>
         <w:keepLines/>
+        <w:pageBreakBefore w:val="0"/>
         <w:spacing w:before="0" w:after="160" w:line="280" w:lineRule="auto"/>
       </w:pPr>
       <w:r>
@@ -3341,6 +3406,7 @@
           <w:numId w:val="15"/>
         </w:numPr>
         <w:keepLines/>
+        <w:pageBreakBefore w:val="0"/>
         <w:spacing w:before="0" w:after="160" w:line="280" w:lineRule="auto"/>
       </w:pPr>
       <w:r>
@@ -3366,6 +3432,7 @@
           <w:numId w:val="15"/>
         </w:numPr>
         <w:keepLines/>
+        <w:pageBreakBefore w:val="0"/>
         <w:spacing w:before="0" w:after="160" w:line="280" w:lineRule="auto"/>
       </w:pPr>
       <w:r>
@@ -3391,6 +3458,7 @@
           <w:numId w:val="15"/>
         </w:numPr>
         <w:keepLines/>
+        <w:pageBreakBefore w:val="0"/>
         <w:spacing w:before="0" w:after="160" w:line="280" w:lineRule="auto"/>
       </w:pPr>
       <w:r>
@@ -3416,6 +3484,7 @@
           <w:numId w:val="15"/>
         </w:numPr>
         <w:keepLines/>
+        <w:pageBreakBefore w:val="0"/>
         <w:spacing w:before="0" w:after="160" w:line="280" w:lineRule="auto"/>
       </w:pPr>
       <w:r>
@@ -3441,6 +3510,7 @@
           <w:numId w:val="15"/>
         </w:numPr>
         <w:keepLines/>
+        <w:pageBreakBefore w:val="0"/>
         <w:spacing w:before="0" w:after="160" w:line="280" w:lineRule="auto"/>
       </w:pPr>
       <w:r>
@@ -3466,6 +3536,7 @@
           <w:numId w:val="15"/>
         </w:numPr>
         <w:keepLines/>
+        <w:pageBreakBefore w:val="0"/>
         <w:spacing w:before="0" w:after="160" w:line="280" w:lineRule="auto"/>
       </w:pPr>
       <w:r>
@@ -3487,6 +3558,7 @@
     <w:p>
       <w:pPr>
         <w:pStyle w:val="Heading1"/>
+        <w:pageBreakBefore/>
       </w:pPr>
       <w:r>
         <w:t>7. Decision and next actions</w:t>
@@ -3995,7 +4067,7 @@
         </w:rPr>
         <w:t xml:space="preserve">[MK1] </w:t>
       </w:r>
-      <w:hyperlink r:id="rId13">
+      <w:hyperlink r:id="rId10">
         <w:r>
           <w:rPr>
             <w:rFonts w:ascii="Calibri" w:hAnsi="Calibri"/>
@@ -4254,7 +4326,7 @@
         </w:rPr>
         <w:t xml:space="preserve">[A1] </w:t>
       </w:r>
-      <w:hyperlink r:id="rId14">
+      <w:hyperlink r:id="rId11">
         <w:r>
           <w:rPr>
             <w:rFonts w:ascii="Calibri" w:hAnsi="Calibri"/>
@@ -4287,7 +4359,7 @@
         </w:rPr>
         <w:t xml:space="preserve">[A2] </w:t>
       </w:r>
-      <w:hyperlink r:id="rId15">
+      <w:hyperlink r:id="rId12">
         <w:r>
           <w:rPr>
             <w:rFonts w:ascii="Calibri" w:hAnsi="Calibri"/>
@@ -4320,7 +4392,7 @@
         </w:rPr>
         <w:t xml:space="preserve">[A3] </w:t>
       </w:r>
-      <w:hyperlink r:id="rId16">
+      <w:hyperlink r:id="rId13">
         <w:r>
           <w:rPr>
             <w:rFonts w:ascii="Calibri" w:hAnsi="Calibri"/>
@@ -4361,7 +4433,7 @@
         </w:rPr>
         <w:t xml:space="preserve">[T1] </w:t>
       </w:r>
-      <w:hyperlink r:id="rId17">
+      <w:hyperlink r:id="rId14">
         <w:r>
           <w:rPr>
             <w:rFonts w:ascii="Calibri" w:hAnsi="Calibri"/>
@@ -4394,7 +4466,7 @@
         </w:rPr>
         <w:t xml:space="preserve">[T2] </w:t>
       </w:r>
-      <w:hyperlink r:id="rId18">
+      <w:hyperlink r:id="rId15">
         <w:r>
           <w:rPr>
             <w:rFonts w:ascii="Calibri" w:hAnsi="Calibri"/>
@@ -4435,7 +4507,7 @@
         </w:rPr>
         <w:t xml:space="preserve">[H1] </w:t>
       </w:r>
-      <w:hyperlink r:id="rId19">
+      <w:hyperlink r:id="rId16">
         <w:r>
           <w:rPr>
             <w:rFonts w:ascii="Calibri" w:hAnsi="Calibri"/>
@@ -4468,7 +4540,7 @@
         </w:rPr>
         <w:t xml:space="preserve">[H2] </w:t>
       </w:r>
-      <w:hyperlink r:id="rId20">
+      <w:hyperlink r:id="rId17">
         <w:r>
           <w:rPr>
             <w:rFonts w:ascii="Calibri" w:hAnsi="Calibri"/>
@@ -4501,7 +4573,7 @@
         </w:rPr>
         <w:t xml:space="preserve">[H3] </w:t>
       </w:r>
-      <w:hyperlink r:id="rId21">
+      <w:hyperlink r:id="rId18">
         <w:r>
           <w:rPr>
             <w:rFonts w:ascii="Calibri" w:hAnsi="Calibri"/>
@@ -4543,7 +4615,7 @@
         </w:rPr>
         <w:t xml:space="preserve">[B1] </w:t>
       </w:r>
-      <w:hyperlink r:id="rId22">
+      <w:hyperlink r:id="rId19">
         <w:r>
           <w:rPr>
             <w:rFonts w:ascii="Calibri" w:hAnsi="Calibri"/>
@@ -4576,7 +4648,7 @@
         </w:rPr>
         <w:t xml:space="preserve">[B2] </w:t>
       </w:r>
-      <w:hyperlink r:id="rId23">
+      <w:hyperlink r:id="rId20">
         <w:r>
           <w:rPr>
             <w:rFonts w:ascii="Calibri" w:hAnsi="Calibri"/>
@@ -4609,7 +4681,7 @@
         </w:rPr>
         <w:t xml:space="preserve">[B3] </w:t>
       </w:r>
-      <w:hyperlink r:id="rId24">
+      <w:hyperlink r:id="rId21">
         <w:r>
           <w:rPr>
             <w:rFonts w:ascii="Calibri" w:hAnsi="Calibri"/>
@@ -4642,7 +4714,7 @@
         </w:rPr>
         <w:t xml:space="preserve">[B4] </w:t>
       </w:r>
-      <w:hyperlink r:id="rId25">
+      <w:hyperlink r:id="rId22">
         <w:r>
           <w:rPr>
             <w:rFonts w:ascii="Calibri" w:hAnsi="Calibri"/>
@@ -4683,7 +4755,7 @@
         </w:rPr>
         <w:t xml:space="preserve">[V1] </w:t>
       </w:r>
-      <w:hyperlink r:id="rId26">
+      <w:hyperlink r:id="rId23">
         <w:r>
           <w:rPr>
             <w:rFonts w:ascii="Calibri" w:hAnsi="Calibri"/>
@@ -4716,7 +4788,7 @@
         </w:rPr>
         <w:t xml:space="preserve">[V2] </w:t>
       </w:r>
-      <w:hyperlink r:id="rId27">
+      <w:hyperlink r:id="rId24">
         <w:r>
           <w:rPr>
             <w:rFonts w:ascii="Calibri" w:hAnsi="Calibri"/>
@@ -4757,7 +4829,7 @@
         </w:rPr>
         <w:t xml:space="preserve">[Q1] </w:t>
       </w:r>
-      <w:hyperlink r:id="rId28">
+      <w:hyperlink r:id="rId25">
         <w:r>
           <w:rPr>
             <w:rFonts w:ascii="Calibri" w:hAnsi="Calibri"/>
@@ -4790,7 +4862,7 @@
         </w:rPr>
         <w:t xml:space="preserve">[Q2] </w:t>
       </w:r>
-      <w:hyperlink r:id="rId29">
+      <w:hyperlink r:id="rId26">
         <w:r>
           <w:rPr>
             <w:rFonts w:ascii="Calibri" w:hAnsi="Calibri"/>
@@ -4823,7 +4895,7 @@
         </w:rPr>
         <w:t xml:space="preserve">[Q3] </w:t>
       </w:r>
-      <w:hyperlink r:id="rId30">
+      <w:hyperlink r:id="rId27">
         <w:r>
           <w:rPr>
             <w:rFonts w:ascii="Calibri" w:hAnsi="Calibri"/>
@@ -4864,7 +4936,7 @@
         </w:rPr>
         <w:t xml:space="preserve">[J1] </w:t>
       </w:r>
-      <w:hyperlink r:id="rId31">
+      <w:hyperlink r:id="rId28">
         <w:r>
           <w:rPr>
             <w:rFonts w:ascii="Calibri" w:hAnsi="Calibri"/>
@@ -4897,7 +4969,7 @@
         </w:rPr>
         <w:t xml:space="preserve">[J2] </w:t>
       </w:r>
-      <w:hyperlink r:id="rId32">
+      <w:hyperlink r:id="rId29">
         <w:r>
           <w:rPr>
             <w:rFonts w:ascii="Calibri" w:hAnsi="Calibri"/>
@@ -4930,7 +5002,7 @@
         </w:rPr>
         <w:t xml:space="preserve">[J3] </w:t>
       </w:r>
-      <w:hyperlink r:id="rId33">
+      <w:hyperlink r:id="rId30">
         <w:r>
           <w:rPr>
             <w:rFonts w:ascii="Calibri" w:hAnsi="Calibri"/>
@@ -4963,7 +5035,7 @@
         </w:rPr>
         <w:t xml:space="preserve">[J4] </w:t>
       </w:r>
-      <w:hyperlink r:id="rId34">
+      <w:hyperlink r:id="rId31">
         <w:r>
           <w:rPr>
             <w:rFonts w:ascii="Calibri" w:hAnsi="Calibri"/>
@@ -5004,7 +5076,7 @@
         </w:rPr>
         <w:t xml:space="preserve">[C1] </w:t>
       </w:r>
-      <w:hyperlink r:id="rId35">
+      <w:hyperlink r:id="rId32">
         <w:r>
           <w:rPr>
             <w:rFonts w:ascii="Calibri" w:hAnsi="Calibri"/>
@@ -5037,7 +5109,7 @@
         </w:rPr>
         <w:t xml:space="preserve">[C2] </w:t>
       </w:r>
-      <w:hyperlink r:id="rId36">
+      <w:hyperlink r:id="rId33">
         <w:r>
           <w:rPr>
             <w:rFonts w:ascii="Calibri" w:hAnsi="Calibri"/>
@@ -5070,7 +5142,7 @@
         </w:rPr>
         <w:t xml:space="preserve">[CT1] </w:t>
       </w:r>
-      <w:hyperlink r:id="rId37">
+      <w:hyperlink r:id="rId34">
         <w:r>
           <w:rPr>
             <w:rFonts w:ascii="Calibri" w:hAnsi="Calibri"/>
@@ -5103,7 +5175,7 @@
         </w:rPr>
         <w:t xml:space="preserve">[CT2] </w:t>
       </w:r>
-      <w:hyperlink r:id="rId38">
+      <w:hyperlink r:id="rId35">
         <w:r>
           <w:rPr>
             <w:rFonts w:ascii="Calibri" w:hAnsi="Calibri"/>
@@ -5136,7 +5208,7 @@
         </w:rPr>
         <w:t xml:space="preserve">[CU1] </w:t>
       </w:r>
-      <w:hyperlink r:id="rId39">
+      <w:hyperlink r:id="rId36">
         <w:r>
           <w:rPr>
             <w:rFonts w:ascii="Calibri" w:hAnsi="Calibri"/>
@@ -5157,10 +5229,7 @@
       </w:r>
     </w:p>
     <w:sectPr>
-      <w:headerReference w:type="default" r:id="rId9"/>
-      <w:headerReference w:type="even" r:id="rId10"/>
-      <w:footerReference w:type="default" r:id="rId11"/>
-      <w:footerReference w:type="even" r:id="rId12"/>
+      <w:footerReference w:type="default" r:id="rId9"/>
       <w:pgSz w:w="12240" w:h="15840"/>
       <w:pgMar w:top="1440" w:right="1440" w:bottom="1440" w:left="1440" w:header="708" w:footer="708" w:gutter="0"/>
       <w:cols w:space="720"/>
@@ -5220,128 +5289,6 @@
     </w:r>
   </w:p>
 </w:ftr>
-</file>
-
-<file path=word/footer2.xml><?xml version="1.0" encoding="utf-8"?>
-<w:ftr xmlns:m="http://schemas.openxmlformats.org/officeDocument/2006/math" xmlns:mc="http://schemas.openxmlformats.org/markup-compatibility/2006" xmlns:mo="http://schemas.microsoft.com/office/mac/office/2008/main" xmlns:mv="urn:schemas-microsoft-com:mac:vml" xmlns:o="urn:schemas-microsoft-com:office:office" xmlns:r="http://schemas.openxmlformats.org/officeDocument/2006/relationships" xmlns:v="urn:schemas-microsoft-com:vml" xmlns:w10="urn:schemas-microsoft-com:office:word" xmlns:w14="http://schemas.microsoft.com/office/word/2010/wordml" xmlns:w="http://schemas.openxmlformats.org/wordprocessingml/2006/main" xmlns:wne="http://schemas.microsoft.com/office/word/2006/wordml" xmlns:wp14="http://schemas.microsoft.com/office/word/2010/wordprocessingDrawing" xmlns:wp="http://schemas.openxmlformats.org/drawingml/2006/wordprocessingDrawing" xmlns:wpc="http://schemas.microsoft.com/office/word/2010/wordprocessingCanvas" xmlns:wpg="http://schemas.microsoft.com/office/word/2010/wordprocessingGroup" xmlns:wpi="http://schemas.microsoft.com/office/word/2010/wordprocessingInk" xmlns:wps="http://schemas.microsoft.com/office/word/2010/wordprocessingShape" mc:Ignorable="w14 wp14">
-  <w:p>
-    <w:pPr>
-      <w:pStyle w:val="Footer"/>
-      <w:spacing w:before="0" w:after="0"/>
-      <w:jc w:val="right"/>
-    </w:pPr>
-    <w:r>
-      <w:rPr>
-        <w:rFonts w:ascii="Calibri" w:hAnsi="Calibri"/>
-        <w:color w:val="5A6573"/>
-        <w:sz w:val="18"/>
-      </w:rPr>
-      <w:t xml:space="preserve">Page </w:t>
-    </w:r>
-    <w:r>
-      <w:rPr>
-        <w:rFonts w:ascii="Calibri" w:hAnsi="Calibri"/>
-        <w:color w:val="5A6573"/>
-        <w:sz w:val="18"/>
-      </w:rPr>
-      <w:fldChar w:fldCharType="begin"/>
-      <w:instrText xml:space="preserve"> PAGE </w:instrText>
-      <w:fldChar w:fldCharType="separate"/>
-      <w:t>1</w:t>
-      <w:fldChar w:fldCharType="end"/>
-    </w:r>
-    <w:r>
-      <w:rPr>
-        <w:rFonts w:ascii="Calibri" w:hAnsi="Calibri"/>
-        <w:color w:val="5A6573"/>
-        <w:sz w:val="18"/>
-      </w:rPr>
-      <w:t xml:space="preserve"> of </w:t>
-    </w:r>
-    <w:r>
-      <w:rPr>
-        <w:rFonts w:ascii="Calibri" w:hAnsi="Calibri"/>
-        <w:color w:val="5A6573"/>
-        <w:sz w:val="18"/>
-      </w:rPr>
-      <w:fldChar w:fldCharType="begin"/>
-      <w:instrText xml:space="preserve"> NUMPAGES </w:instrText>
-      <w:fldChar w:fldCharType="separate"/>
-      <w:t>1</w:t>
-      <w:fldChar w:fldCharType="end"/>
-    </w:r>
-  </w:p>
-</w:ftr>
-</file>
-
-<file path=word/header1.xml><?xml version="1.0" encoding="utf-8"?>
-<w:hdr xmlns:m="http://schemas.openxmlformats.org/officeDocument/2006/math" xmlns:mc="http://schemas.openxmlformats.org/markup-compatibility/2006" xmlns:mo="http://schemas.microsoft.com/office/mac/office/2008/main" xmlns:mv="urn:schemas-microsoft-com:mac:vml" xmlns:o="urn:schemas-microsoft-com:office:office" xmlns:r="http://schemas.openxmlformats.org/officeDocument/2006/relationships" xmlns:v="urn:schemas-microsoft-com:vml" xmlns:w10="urn:schemas-microsoft-com:office:word" xmlns:w14="http://schemas.microsoft.com/office/word/2010/wordml" xmlns:w="http://schemas.openxmlformats.org/wordprocessingml/2006/main" xmlns:wne="http://schemas.microsoft.com/office/word/2006/wordml" xmlns:wp14="http://schemas.microsoft.com/office/word/2010/wordprocessingDrawing" xmlns:wp="http://schemas.openxmlformats.org/drawingml/2006/wordprocessingDrawing" xmlns:wpc="http://schemas.microsoft.com/office/word/2010/wordprocessingCanvas" xmlns:wpg="http://schemas.microsoft.com/office/word/2010/wordprocessingGroup" xmlns:wpi="http://schemas.microsoft.com/office/word/2010/wordprocessingInk" xmlns:wps="http://schemas.microsoft.com/office/word/2010/wordprocessingShape" mc:Ignorable="w14 wp14">
-  <w:p>
-    <w:pPr>
-      <w:pStyle w:val="Header"/>
-      <w:tabs>
-        <w:tab w:pos="9360" w:val="left"/>
-      </w:tabs>
-      <w:spacing w:before="0" w:after="0"/>
-    </w:pPr>
-    <w:r>
-      <w:rPr>
-        <w:rFonts w:ascii="Calibri" w:hAnsi="Calibri"/>
-        <w:b/>
-        <w:color w:val="5A6573"/>
-        <w:sz w:val="17"/>
-      </w:rPr>
-      <w:t>MALLARD | TECHNICAL RESEARCH</w:t>
-    </w:r>
-    <w:r>
-      <w:tab/>
-    </w:r>
-    <w:r>
-      <w:rPr>
-        <w:rFonts w:ascii="Calibri" w:hAnsi="Calibri"/>
-        <w:b/>
-        <w:color w:val="5A6573"/>
-        <w:sz w:val="17"/>
-      </w:rPr>
-      <w:t>MAINLAND CHINA OBJECT STORAGE</w:t>
-    </w:r>
-  </w:p>
-</w:hdr>
-</file>
-
-<file path=word/header2.xml><?xml version="1.0" encoding="utf-8"?>
-<w:hdr xmlns:m="http://schemas.openxmlformats.org/officeDocument/2006/math" xmlns:mc="http://schemas.openxmlformats.org/markup-compatibility/2006" xmlns:mo="http://schemas.microsoft.com/office/mac/office/2008/main" xmlns:mv="urn:schemas-microsoft-com:mac:vml" xmlns:o="urn:schemas-microsoft-com:office:office" xmlns:r="http://schemas.openxmlformats.org/officeDocument/2006/relationships" xmlns:v="urn:schemas-microsoft-com:vml" xmlns:w10="urn:schemas-microsoft-com:office:word" xmlns:w14="http://schemas.microsoft.com/office/word/2010/wordml" xmlns:w="http://schemas.openxmlformats.org/wordprocessingml/2006/main" xmlns:wne="http://schemas.microsoft.com/office/word/2006/wordml" xmlns:wp14="http://schemas.microsoft.com/office/word/2010/wordprocessingDrawing" xmlns:wp="http://schemas.openxmlformats.org/drawingml/2006/wordprocessingDrawing" xmlns:wpc="http://schemas.microsoft.com/office/word/2010/wordprocessingCanvas" xmlns:wpg="http://schemas.microsoft.com/office/word/2010/wordprocessingGroup" xmlns:wpi="http://schemas.microsoft.com/office/word/2010/wordprocessingInk" xmlns:wps="http://schemas.microsoft.com/office/word/2010/wordprocessingShape" mc:Ignorable="w14 wp14">
-  <w:p>
-    <w:pPr>
-      <w:pStyle w:val="Header"/>
-      <w:tabs>
-        <w:tab w:pos="9360" w:val="left"/>
-      </w:tabs>
-      <w:spacing w:before="0" w:after="0"/>
-    </w:pPr>
-    <w:r>
-      <w:rPr>
-        <w:rFonts w:ascii="Calibri" w:hAnsi="Calibri"/>
-        <w:b/>
-        <w:color w:val="5A6573"/>
-        <w:sz w:val="17"/>
-      </w:rPr>
-      <w:t>MALLARD | TECHNICAL RESEARCH</w:t>
-    </w:r>
-    <w:r>
-      <w:tab/>
-    </w:r>
-    <w:r>
-      <w:rPr>
-        <w:rFonts w:ascii="Calibri" w:hAnsi="Calibri"/>
-        <w:b/>
-        <w:color w:val="5A6573"/>
-        <w:sz w:val="17"/>
-      </w:rPr>
-      <w:t>MAINLAND CHINA OBJECT STORAGE</w:t>
-    </w:r>
-  </w:p>
-</w:hdr>
 </file>
 
 <file path=word/numbering.xml><?xml version="1.0" encoding="utf-8"?>

</xml_diff>